<commit_message>
added placeholder for QR and Seal
</commit_message>
<xml_diff>
--- a/public/files/BARANGAY-CERTIFICATION.docx
+++ b/public/files/BARANGAY-CERTIFICATION.docx
@@ -540,7 +540,7 @@
           </mc:Choice>
           <mc:Fallback>
             <w:pict>
-              <v:shape w14:anchorId="5A3CB7E5" id="Text Box 2" o:spid="_x0000_s1027" type="#_x0000_t202" style="position:absolute;left:0;text-align:left;margin-left:121.15pt;margin-top:335.5pt;width:377.25pt;height:81pt;z-index:251666432;visibility:visible;mso-wrap-style:square;mso-height-percent:0;mso-wrap-distance-left:9pt;mso-wrap-distance-top:3.6pt;mso-wrap-distance-right:9pt;mso-wrap-distance-bottom:3.6pt;mso-position-horizontal:absolute;mso-position-horizontal-relative:text;mso-position-vertical:absolute;mso-position-vertical-relative:text;mso-height-percent:0;mso-height-relative:margin;v-text-anchor:top" o:gfxdata="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" filled="f" stroked="f">
+              <v:shape w14:anchorId="5A3CB7E5" id="_x0000_s1028" type="#_x0000_t202" style="position:absolute;left:0;text-align:left;margin-left:121.15pt;margin-top:335.5pt;width:377.25pt;height:81pt;z-index:251666432;visibility:visible;mso-wrap-style:square;mso-height-percent:0;mso-wrap-distance-left:9pt;mso-wrap-distance-top:3.6pt;mso-wrap-distance-right:9pt;mso-wrap-distance-bottom:3.6pt;mso-position-horizontal:absolute;mso-position-horizontal-relative:text;mso-position-vertical:absolute;mso-position-vertical-relative:text;mso-height-percent:0;mso-height-relative:margin;v-text-anchor:top" o:gfxdata="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" filled="f" stroked="f">
                 <v:textbox>
                   <w:txbxContent>
                     <w:p>
@@ -560,25 +560,7 @@
                           <w:szCs w:val="24"/>
                           <w:lang w:val="en-US"/>
                         </w:rPr>
-                        <w:t>Further certifies that he/ she has no derogatory record and has good moral character as per our Barangay record in con</w:t>
-                      </w:r>
-                      <w:r>
-                        <w:rPr>
-                          <w:rFonts w:ascii="Times New Roman" w:hAnsi="Times New Roman" w:cs="Times New Roman"/>
-                          <w:sz w:val="24"/>
-                          <w:szCs w:val="24"/>
-                          <w:lang w:val="en-US"/>
-                        </w:rPr>
-                        <w:t>cerned</w:t>
-                      </w:r>
-                      <w:r>
-                        <w:rPr>
-                          <w:rFonts w:ascii="Times New Roman" w:hAnsi="Times New Roman" w:cs="Times New Roman"/>
-                          <w:sz w:val="24"/>
-                          <w:szCs w:val="24"/>
-                          <w:lang w:val="en-US"/>
-                        </w:rPr>
-                        <w:t xml:space="preserve">. </w:t>
+                        <w:t xml:space="preserve">Further certifies that he/ she has no derogatory record and has good moral character as per our Barangay record in concerned. </w:t>
                       </w:r>
                     </w:p>
                     <w:p>
@@ -690,10 +672,7 @@
                             </w:r>
                             <w:proofErr w:type="spellEnd"/>
                             <w:r>
-                              <w:t>}</w:t>
-                            </w:r>
-                            <w:r>
-                              <w:t xml:space="preserve"> </w:t>
+                              <w:t xml:space="preserve">} </w:t>
                             </w:r>
                             <w:r>
                               <w:t>of legal age, male/female, single/married/widow/ widower, Filipino citizen, whose name and signature/right thumb mark appears below is a BONAFIDE and permanent resident of BRGY. GUIN-ON, Calbayog City, Samar.</w:t>
@@ -745,10 +724,7 @@
                       </w:r>
                       <w:proofErr w:type="spellEnd"/>
                       <w:r>
-                        <w:t>}</w:t>
-                      </w:r>
-                      <w:r>
-                        <w:t xml:space="preserve"> </w:t>
+                        <w:t xml:space="preserve">} </w:t>
                       </w:r>
                       <w:r>
                         <w:t>of legal age, male/female, single/married/widow/ widower, Filipino citizen, whose name and signature/right thumb mark appears below is a BONAFIDE and permanent resident of BRGY. GUIN-ON, Calbayog City, Samar.</w:t>
@@ -834,7 +810,7 @@
           </mc:Choice>
           <mc:Fallback>
             <w:pict>
-              <v:shape w14:anchorId="18FF4AC6" id="_x0000_s1029" type="#_x0000_t202" style="position:absolute;left:0;text-align:left;margin-left:121.5pt;margin-top:201pt;width:185.9pt;height:23.25pt;z-index:251664384;visibility:visible;mso-wrap-style:square;mso-width-percent:400;mso-height-percent:0;mso-wrap-distance-left:9pt;mso-wrap-distance-top:3.6pt;mso-wrap-distance-right:9pt;mso-wrap-distance-bottom:3.6pt;mso-position-horizontal:absolute;mso-position-horizontal-relative:text;mso-position-vertical:absolute;mso-position-vertical-relative:text;mso-width-percent:400;mso-height-percent:0;mso-width-relative:margin;mso-height-relative:page;v-text-anchor:top" o:gfxdata="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" filled="f" stroked="f">
+              <v:shape w14:anchorId="18FF4AC6" id="_x0000_s1030" type="#_x0000_t202" style="position:absolute;left:0;text-align:left;margin-left:121.5pt;margin-top:201pt;width:185.9pt;height:23.25pt;z-index:251664384;visibility:visible;mso-wrap-style:square;mso-width-percent:400;mso-height-percent:0;mso-wrap-distance-left:9pt;mso-wrap-distance-top:3.6pt;mso-wrap-distance-right:9pt;mso-wrap-distance-bottom:3.6pt;mso-position-horizontal:absolute;mso-position-horizontal-relative:text;mso-position-vertical:absolute;mso-position-vertical-relative:text;mso-width-percent:400;mso-height-percent:0;mso-width-relative:margin;mso-height-relative:page;v-text-anchor:top" o:gfxdata="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" filled="f" stroked="f">
                 <v:textbox>
                   <w:txbxContent>
                     <w:p>
@@ -996,7 +972,7 @@
           </mc:Choice>
           <mc:Fallback>
             <w:pict>
-              <v:shape w14:anchorId="0347F4E2" id="_x0000_s1030" type="#_x0000_t202" style="position:absolute;left:0;text-align:left;margin-left:168.75pt;margin-top:145.1pt;width:292.2pt;height:110.6pt;z-index:251663360;visibility:visible;mso-wrap-style:square;mso-width-percent:0;mso-height-percent:200;mso-wrap-distance-left:9pt;mso-wrap-distance-top:3.6pt;mso-wrap-distance-right:9pt;mso-wrap-distance-bottom:3.6pt;mso-position-horizontal:absolute;mso-position-horizontal-relative:margin;mso-position-vertical:absolute;mso-position-vertical-relative:text;mso-width-percent:0;mso-height-percent:200;mso-width-relative:page;mso-height-relative:margin;v-text-anchor:top" o:gfxdata="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" filled="f" stroked="f">
+              <v:shape w14:anchorId="0347F4E2" id="_x0000_s1031" type="#_x0000_t202" style="position:absolute;left:0;text-align:left;margin-left:168.75pt;margin-top:145.1pt;width:292.2pt;height:110.6pt;z-index:251663360;visibility:visible;mso-wrap-style:square;mso-width-percent:0;mso-height-percent:200;mso-wrap-distance-left:9pt;mso-wrap-distance-top:3.6pt;mso-wrap-distance-right:9pt;mso-wrap-distance-bottom:3.6pt;mso-position-horizontal:absolute;mso-position-horizontal-relative:margin;mso-position-vertical:absolute;mso-position-vertical-relative:text;mso-width-percent:0;mso-height-percent:200;mso-width-relative:page;mso-height-relative:margin;v-text-anchor:top" o:gfxdata="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" filled="f" stroked="f">
                 <v:textbox style="mso-fit-shape-to-text:t">
                   <w:txbxContent>
                     <w:p>
@@ -1016,16 +992,7 @@
                           <w:szCs w:val="44"/>
                           <w:lang w:val="en-US"/>
                         </w:rPr>
-                        <w:t xml:space="preserve">BARANGAY </w:t>
-                      </w:r>
-                      <w:r>
-                        <w:rPr>
-                          <w:rFonts w:ascii="Bernard MT Condensed" w:hAnsi="Bernard MT Condensed"/>
-                          <w:sz w:val="44"/>
-                          <w:szCs w:val="44"/>
-                          <w:lang w:val="en-US"/>
-                        </w:rPr>
-                        <w:t>CERTIFICATION</w:t>
+                        <w:t>BARANGAY CERTIFICATION</w:t>
                       </w:r>
                     </w:p>
                   </w:txbxContent>
@@ -1120,7 +1087,7 @@
           </mc:Choice>
           <mc:Fallback>
             <w:pict>
-              <v:shape w14:anchorId="255867DF" id="_x0000_s1031" type="#_x0000_t202" style="position:absolute;left:0;text-align:left;margin-left:300.6pt;margin-top:593.65pt;width:210.45pt;height:39.75pt;z-index:251669504;visibility:visible;mso-wrap-style:square;mso-wrap-distance-left:9pt;mso-wrap-distance-top:3.6pt;mso-wrap-distance-right:9pt;mso-wrap-distance-bottom:3.6pt;mso-position-horizontal:absolute;mso-position-horizontal-relative:text;mso-position-vertical:absolute;mso-position-vertical-relative:text;v-text-anchor:top" o:gfxdata="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" filled="f" stroked="f">
+              <v:shape w14:anchorId="255867DF" id="_x0000_s1032" type="#_x0000_t202" style="position:absolute;left:0;text-align:left;margin-left:300.6pt;margin-top:593.65pt;width:210.45pt;height:39.75pt;z-index:251669504;visibility:visible;mso-wrap-style:square;mso-wrap-distance-left:9pt;mso-wrap-distance-top:3.6pt;mso-wrap-distance-right:9pt;mso-wrap-distance-bottom:3.6pt;mso-position-horizontal:absolute;mso-position-horizontal-relative:text;mso-position-vertical:absolute;mso-position-vertical-relative:text;v-text-anchor:top" o:gfxdata="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" filled="f" stroked="f">
                 <v:textbox>
                   <w:txbxContent>
                     <w:p>
@@ -1248,7 +1215,7 @@
           </mc:Choice>
           <mc:Fallback>
             <w:pict>
-              <v:shape w14:anchorId="43D0C62F" id="_x0000_s1032" type="#_x0000_t202" style="position:absolute;left:0;text-align:left;margin-left:323.7pt;margin-top:521.65pt;width:185.9pt;height:40.5pt;z-index:251668480;visibility:visible;mso-wrap-style:square;mso-width-percent:400;mso-height-percent:0;mso-wrap-distance-left:9pt;mso-wrap-distance-top:3.6pt;mso-wrap-distance-right:9pt;mso-wrap-distance-bottom:3.6pt;mso-position-horizontal:absolute;mso-position-horizontal-relative:text;mso-position-vertical:absolute;mso-position-vertical-relative:text;mso-width-percent:400;mso-height-percent:0;mso-width-relative:margin;mso-height-relative:page;v-text-anchor:top" o:gfxdata="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" filled="f" stroked="f">
+              <v:shape w14:anchorId="43D0C62F" id="_x0000_s1033" type="#_x0000_t202" style="position:absolute;left:0;text-align:left;margin-left:323.7pt;margin-top:521.65pt;width:185.9pt;height:40.5pt;z-index:251668480;visibility:visible;mso-wrap-style:square;mso-width-percent:400;mso-height-percent:0;mso-wrap-distance-left:9pt;mso-wrap-distance-top:3.6pt;mso-wrap-distance-right:9pt;mso-wrap-distance-bottom:3.6pt;mso-position-horizontal:absolute;mso-position-horizontal-relative:text;mso-position-vertical:absolute;mso-position-vertical-relative:text;mso-width-percent:400;mso-height-percent:0;mso-width-relative:margin;mso-height-relative:page;v-text-anchor:top" o:gfxdata="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" filled="f" stroked="f">
                 <v:textbox>
                   <w:txbxContent>
                     <w:p>
@@ -1432,7 +1399,7 @@
           </mc:Choice>
           <mc:Fallback>
             <w:pict>
-              <v:shape w14:anchorId="5C7A151F" id="_x0000_s1033" type="#_x0000_t202" style="position:absolute;left:0;text-align:left;margin-left:0;margin-top:701.85pt;width:1in;height:25.5pt;z-index:251670528;visibility:visible;mso-wrap-style:none;mso-wrap-distance-left:9pt;mso-wrap-distance-top:0;mso-wrap-distance-right:9pt;mso-wrap-distance-bottom:0;mso-position-horizontal:left;mso-position-horizontal-relative:page;mso-position-vertical:absolute;mso-position-vertical-relative:text;v-text-anchor:top" o:gfxdata="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" fillcolor="white [3201]" stroked="f" strokeweight=".5pt">
+              <v:shape w14:anchorId="5C7A151F" id="_x0000_s1034" type="#_x0000_t202" style="position:absolute;left:0;text-align:left;margin-left:0;margin-top:701.85pt;width:1in;height:25.5pt;z-index:251670528;visibility:visible;mso-wrap-style:none;mso-wrap-distance-left:9pt;mso-wrap-distance-top:0;mso-wrap-distance-right:9pt;mso-wrap-distance-bottom:0;mso-position-horizontal:left;mso-position-horizontal-relative:page;mso-position-vertical:absolute;mso-position-vertical-relative:text;v-text-anchor:top" o:gfxdata="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" fillcolor="white [3201]" stroked="f" strokeweight=".5pt">
                 <v:textbox>
                   <w:txbxContent>
                     <w:p>
@@ -1468,7 +1435,7 @@
         <mc:AlternateContent>
           <mc:Choice Requires="wpg">
             <w:drawing>
-              <wp:anchor distT="0" distB="0" distL="114300" distR="114300" simplePos="0" relativeHeight="251672576" behindDoc="0" locked="0" layoutInCell="1" allowOverlap="1" wp14:anchorId="717D68C5" wp14:editId="73293796">
+              <wp:anchor distT="0" distB="0" distL="114300" distR="114300" simplePos="0" relativeHeight="251672576" behindDoc="0" locked="0" layoutInCell="1" allowOverlap="1" wp14:anchorId="717D68C5" wp14:editId="0453C2B4">
                 <wp:simplePos x="0" y="0"/>
                 <wp:positionH relativeFrom="column">
                   <wp:posOffset>5493385</wp:posOffset>
@@ -1479,7 +1446,7 @@
                 <wp:extent cx="1057910" cy="1059180"/>
                 <wp:effectExtent l="0" t="0" r="27940" b="26670"/>
                 <wp:wrapNone/>
-                <wp:docPr id="570919113" name="Group 61"/>
+                <wp:docPr id="570919113" name="Group 61" descr="{seal}"/>
                 <wp:cNvGraphicFramePr/>
                 <a:graphic xmlns:a="http://schemas.openxmlformats.org/drawingml/2006/main">
                   <a:graphicData uri="http://schemas.microsoft.com/office/word/2010/wordprocessingGroup">
@@ -1610,11 +1577,11 @@
           </mc:Choice>
           <mc:Fallback>
             <w:pict>
-              <v:group w14:anchorId="717D68C5" id="Group 61" o:spid="_x0000_s1034" style="position:absolute;left:0;text-align:left;margin-left:432.55pt;margin-top:678pt;width:83.3pt;height:83.4pt;z-index:251672576" coordsize="10584,10591" o:gfxdata="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">
+              <v:group w14:anchorId="717D68C5" id="Group 61" o:spid="_x0000_s1035" alt="{seal}" style="position:absolute;left:0;text-align:left;margin-left:432.55pt;margin-top:678pt;width:83.3pt;height:83.4pt;z-index:251672576" coordsize="10584,10591" o:gfxdata="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">
                 <v:shapetype id="_x0000_t120" coordsize="21600,21600" o:spt="120" path="m10800,qx,10800,10800,21600,21600,10800,10800,xe">
                   <v:path gradientshapeok="t" o:connecttype="custom" o:connectlocs="10800,0;3163,3163;0,10800;3163,18437;10800,21600;18437,18437;21600,10800;18437,3163" textboxrect="3163,3163,18437,18437"/>
                 </v:shapetype>
-                <v:shape id="Flowchart: Connector 8" o:spid="_x0000_s1035" type="#_x0000_t120" style="position:absolute;width:10584;height:10591;visibility:visible;mso-wrap-style:square;v-text-anchor:middle" o:gfxdata="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" fillcolor="white [3201]" strokecolor="#7f7f7f [1612]" strokeweight=".25pt">
+                <v:shape id="Flowchart: Connector 8" o:spid="_x0000_s1036" type="#_x0000_t120" style="position:absolute;width:10584;height:10591;visibility:visible;mso-wrap-style:square;v-text-anchor:middle" o:gfxdata="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" fillcolor="white [3201]" strokecolor="#7f7f7f [1612]" strokeweight=".25pt">
                   <v:stroke joinstyle="miter"/>
                   <v:textbox>
                     <w:txbxContent>
@@ -1626,7 +1593,7 @@
                     </w:txbxContent>
                   </v:textbox>
                 </v:shape>
-                <v:shape id="_x0000_s1036" type="#_x0000_t202" style="position:absolute;left:1797;top:2854;width:7048;height:5016;visibility:visible;mso-wrap-style:square;v-text-anchor:top" o:gfxdata="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" stroked="f">
+                <v:shape id="_x0000_s1037" type="#_x0000_t202" style="position:absolute;left:1797;top:2854;width:7048;height:5016;visibility:visible;mso-wrap-style:square;v-text-anchor:top" o:gfxdata="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" stroked="f">
                   <v:textbox style="mso-fit-shape-to-text:t">
                     <w:txbxContent>
                       <w:p>
@@ -1677,7 +1644,7 @@
           <w14:ligatures w14:val="none"/>
         </w:rPr>
         <w:drawing>
-          <wp:anchor distT="0" distB="0" distL="114300" distR="114300" simplePos="0" relativeHeight="251687936" behindDoc="1" locked="0" layoutInCell="1" allowOverlap="1" wp14:anchorId="0F467699" wp14:editId="6BEF5E62">
+          <wp:anchor distT="0" distB="0" distL="114300" distR="114300" simplePos="0" relativeHeight="251687936" behindDoc="1" locked="0" layoutInCell="1" allowOverlap="1" wp14:anchorId="0F467699" wp14:editId="643A6FAA">
             <wp:simplePos x="0" y="0"/>
             <wp:positionH relativeFrom="margin">
               <wp:posOffset>4341919</wp:posOffset>
@@ -1688,7 +1655,7 @@
             <wp:extent cx="1062395" cy="1062395"/>
             <wp:effectExtent l="0" t="0" r="0" b="0"/>
             <wp:wrapNone/>
-            <wp:docPr id="1117202640" name="Picture 46"/>
+            <wp:docPr id="1117202640" name="Picture 46" descr="{qr}"/>
             <wp:cNvGraphicFramePr>
               <a:graphicFrameLocks xmlns:a="http://schemas.openxmlformats.org/drawingml/2006/main" noChangeAspect="1"/>
             </wp:cNvGraphicFramePr>
@@ -1696,7 +1663,7 @@
               <a:graphicData uri="http://schemas.openxmlformats.org/drawingml/2006/picture">
                 <pic:pic xmlns:pic="http://schemas.openxmlformats.org/drawingml/2006/picture">
                   <pic:nvPicPr>
-                    <pic:cNvPr id="1117202640" name="Picture 1117202640"/>
+                    <pic:cNvPr id="1117202640" name="Picture 46" descr="{qr}"/>
                     <pic:cNvPicPr/>
                   </pic:nvPicPr>
                   <pic:blipFill>
@@ -2676,7 +2643,7 @@
           </mc:Choice>
           <mc:Fallback>
             <w:pict>
-              <v:shape w14:anchorId="044B6BA7" id="Text Box 12" o:spid="_x0000_s1048" type="#_x0000_t202" style="position:absolute;left:0;text-align:left;margin-left:-59pt;margin-top:139.35pt;width:177pt;height:31.5pt;z-index:251675648;visibility:visible;mso-wrap-style:square;mso-wrap-distance-left:9pt;mso-wrap-distance-top:0;mso-wrap-distance-right:9pt;mso-wrap-distance-bottom:0;mso-position-horizontal:absolute;mso-position-horizontal-relative:text;mso-position-vertical:absolute;mso-position-vertical-relative:text;v-text-anchor:top" o:gfxdata="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" filled="f" stroked="f" strokeweight=".5pt">
+              <v:shape w14:anchorId="044B6BA7" id="Text Box 12" o:spid="_x0000_s1049" type="#_x0000_t202" style="position:absolute;left:0;text-align:left;margin-left:-59pt;margin-top:139.35pt;width:177pt;height:31.5pt;z-index:251675648;visibility:visible;mso-wrap-style:square;mso-wrap-distance-left:9pt;mso-wrap-distance-top:0;mso-wrap-distance-right:9pt;mso-wrap-distance-bottom:0;mso-position-horizontal:absolute;mso-position-horizontal-relative:text;mso-position-vertical:absolute;mso-position-vertical-relative:text;v-text-anchor:top" o:gfxdata="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" filled="f" stroked="f" strokeweight=".5pt">
                 <v:textbox>
                   <w:txbxContent>
                     <w:p>
@@ -2827,7 +2794,7 @@
           </mc:Choice>
           <mc:Fallback>
             <w:pict>
-              <v:shape w14:anchorId="742E6B63" id="Text Box 10" o:spid="_x0000_s1049" type="#_x0000_t202" style="position:absolute;left:0;text-align:left;margin-left:-60.1pt;margin-top:231.05pt;width:174.75pt;height:48pt;z-index:251673600;visibility:visible;mso-wrap-style:square;mso-wrap-distance-left:9pt;mso-wrap-distance-top:0;mso-wrap-distance-right:9pt;mso-wrap-distance-bottom:0;mso-position-horizontal:absolute;mso-position-horizontal-relative:text;mso-position-vertical:absolute;mso-position-vertical-relative:text;v-text-anchor:top" o:gfxdata="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" filled="f" stroked="f" strokeweight=".5pt">
+              <v:shape w14:anchorId="742E6B63" id="Text Box 10" o:spid="_x0000_s1050" type="#_x0000_t202" style="position:absolute;left:0;text-align:left;margin-left:-60.1pt;margin-top:231.05pt;width:174.75pt;height:48pt;z-index:251673600;visibility:visible;mso-wrap-style:square;mso-wrap-distance-left:9pt;mso-wrap-distance-top:0;mso-wrap-distance-right:9pt;mso-wrap-distance-bottom:0;mso-position-horizontal:absolute;mso-position-horizontal-relative:text;mso-position-vertical:absolute;mso-position-vertical-relative:text;v-text-anchor:top" o:gfxdata="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" filled="f" stroked="f" strokeweight=".5pt">
                 <v:textbox>
                   <w:txbxContent>
                     <w:p>
@@ -3034,7 +3001,7 @@
           </mc:Choice>
           <mc:Fallback>
             <w:pict>
-              <v:shape w14:anchorId="64F56BF1" id="_x0000_s1050" type="#_x0000_t202" style="position:absolute;left:0;text-align:left;margin-left:-60.35pt;margin-top:274.65pt;width:178.35pt;height:54pt;z-index:251677696;visibility:visible;mso-wrap-style:square;mso-wrap-distance-left:9pt;mso-wrap-distance-top:3.6pt;mso-wrap-distance-right:9pt;mso-wrap-distance-bottom:3.6pt;mso-position-horizontal:absolute;mso-position-horizontal-relative:text;mso-position-vertical:absolute;mso-position-vertical-relative:text;v-text-anchor:top" o:gfxdata="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" filled="f" stroked="f">
+              <v:shape w14:anchorId="64F56BF1" id="_x0000_s1051" type="#_x0000_t202" style="position:absolute;left:0;text-align:left;margin-left:-60.35pt;margin-top:274.65pt;width:178.35pt;height:54pt;z-index:251677696;visibility:visible;mso-wrap-style:square;mso-wrap-distance-left:9pt;mso-wrap-distance-top:3.6pt;mso-wrap-distance-right:9pt;mso-wrap-distance-bottom:3.6pt;mso-position-horizontal:absolute;mso-position-horizontal-relative:text;mso-position-vertical:absolute;mso-position-vertical-relative:text;v-text-anchor:top" o:gfxdata="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" filled="f" stroked="f">
                 <v:textbox>
                   <w:txbxContent>
                     <w:p>
@@ -3237,7 +3204,7 @@
           </mc:Choice>
           <mc:Fallback>
             <w:pict>
-              <v:shape w14:anchorId="0A7BE94A" id="Text Box 11" o:spid="_x0000_s1051" type="#_x0000_t202" style="position:absolute;left:0;text-align:left;margin-left:-58.35pt;margin-top:323.55pt;width:177.7pt;height:61.5pt;z-index:251674624;visibility:visible;mso-wrap-style:square;mso-wrap-distance-left:9pt;mso-wrap-distance-top:0;mso-wrap-distance-right:9pt;mso-wrap-distance-bottom:0;mso-position-horizontal:absolute;mso-position-horizontal-relative:text;mso-position-vertical:absolute;mso-position-vertical-relative:text;v-text-anchor:top" o:gfxdata="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" filled="f" stroked="f" strokeweight=".5pt">
+              <v:shape w14:anchorId="0A7BE94A" id="Text Box 11" o:spid="_x0000_s1052" type="#_x0000_t202" style="position:absolute;left:0;text-align:left;margin-left:-58.35pt;margin-top:323.55pt;width:177.7pt;height:61.5pt;z-index:251674624;visibility:visible;mso-wrap-style:square;mso-wrap-distance-left:9pt;mso-wrap-distance-top:0;mso-wrap-distance-right:9pt;mso-wrap-distance-bottom:0;mso-position-horizontal:absolute;mso-position-horizontal-relative:text;mso-position-vertical:absolute;mso-position-vertical-relative:text;v-text-anchor:top" o:gfxdata="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" filled="f" stroked="f" strokeweight=".5pt">
                 <v:textbox>
                   <w:txbxContent>
                     <w:p>
@@ -3453,7 +3420,7 @@
           </mc:Choice>
           <mc:Fallback>
             <w:pict>
-              <v:shape w14:anchorId="06801FD1" id="_x0000_s1052" type="#_x0000_t202" style="position:absolute;left:0;text-align:left;margin-left:-63.35pt;margin-top:547.65pt;width:185.9pt;height:46.5pt;z-index:251681792;visibility:visible;mso-wrap-style:square;mso-width-percent:400;mso-height-percent:0;mso-wrap-distance-left:9pt;mso-wrap-distance-top:3.6pt;mso-wrap-distance-right:9pt;mso-wrap-distance-bottom:3.6pt;mso-position-horizontal:absolute;mso-position-horizontal-relative:text;mso-position-vertical:absolute;mso-position-vertical-relative:text;mso-width-percent:400;mso-height-percent:0;mso-width-relative:margin;mso-height-relative:page;v-text-anchor:top" o:gfxdata="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" filled="f" stroked="f">
+              <v:shape w14:anchorId="06801FD1" id="_x0000_s1053" type="#_x0000_t202" style="position:absolute;left:0;text-align:left;margin-left:-63.35pt;margin-top:547.65pt;width:185.9pt;height:46.5pt;z-index:251681792;visibility:visible;mso-wrap-style:square;mso-width-percent:400;mso-height-percent:0;mso-wrap-distance-left:9pt;mso-wrap-distance-top:3.6pt;mso-wrap-distance-right:9pt;mso-wrap-distance-bottom:3.6pt;mso-position-horizontal:absolute;mso-position-horizontal-relative:text;mso-position-vertical:absolute;mso-position-vertical-relative:text;mso-width-percent:400;mso-height-percent:0;mso-width-relative:margin;mso-height-relative:page;v-text-anchor:top" o:gfxdata="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" filled="f" stroked="f">
                 <v:textbox>
                   <w:txbxContent>
                     <w:p>
@@ -3645,7 +3612,7 @@
           </mc:Choice>
           <mc:Fallback>
             <w:pict>
-              <v:shape w14:anchorId="53A15C9E" id="_x0000_s1053" type="#_x0000_t202" style="position:absolute;left:0;text-align:left;margin-left:-59.1pt;margin-top:636.25pt;width:176.25pt;height:35.25pt;z-index:251683840;visibility:visible;mso-wrap-style:square;mso-wrap-distance-left:9pt;mso-wrap-distance-top:3.6pt;mso-wrap-distance-right:9pt;mso-wrap-distance-bottom:3.6pt;mso-position-horizontal:absolute;mso-position-horizontal-relative:text;mso-position-vertical:absolute;mso-position-vertical-relative:text;v-text-anchor:top" o:gfxdata="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" filled="f" stroked="f">
+              <v:shape w14:anchorId="53A15C9E" id="_x0000_s1054" type="#_x0000_t202" style="position:absolute;left:0;text-align:left;margin-left:-59.1pt;margin-top:636.25pt;width:176.25pt;height:35.25pt;z-index:251683840;visibility:visible;mso-wrap-style:square;mso-wrap-distance-left:9pt;mso-wrap-distance-top:3.6pt;mso-wrap-distance-right:9pt;mso-wrap-distance-bottom:3.6pt;mso-position-horizontal:absolute;mso-position-horizontal-relative:text;mso-position-vertical:absolute;mso-position-vertical-relative:text;v-text-anchor:top" o:gfxdata="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" filled="f" stroked="f">
                 <v:textbox>
                   <w:txbxContent>
                     <w:p>
@@ -3815,7 +3782,7 @@
           </mc:Choice>
           <mc:Fallback>
             <w:pict>
-              <v:shape w14:anchorId="5338AEDD" id="_x0000_s1054" type="#_x0000_t202" style="position:absolute;left:0;text-align:left;margin-left:-59.6pt;margin-top:600pt;width:177.7pt;height:35.25pt;z-index:251682816;visibility:visible;mso-wrap-style:square;mso-wrap-distance-left:9pt;mso-wrap-distance-top:3.6pt;mso-wrap-distance-right:9pt;mso-wrap-distance-bottom:3.6pt;mso-position-horizontal:absolute;mso-position-horizontal-relative:text;mso-position-vertical:absolute;mso-position-vertical-relative:text;v-text-anchor:top" o:gfxdata="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" filled="f" stroked="f">
+              <v:shape w14:anchorId="5338AEDD" id="_x0000_s1055" type="#_x0000_t202" style="position:absolute;left:0;text-align:left;margin-left:-59.6pt;margin-top:600pt;width:177.7pt;height:35.25pt;z-index:251682816;visibility:visible;mso-wrap-style:square;mso-wrap-distance-left:9pt;mso-wrap-distance-top:3.6pt;mso-wrap-distance-right:9pt;mso-wrap-distance-bottom:3.6pt;mso-position-horizontal:absolute;mso-position-horizontal-relative:text;mso-position-vertical:absolute;mso-position-vertical-relative:text;v-text-anchor:top" o:gfxdata="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" filled="f" stroked="f">
                 <v:textbox>
                   <w:txbxContent>
                     <w:p>
@@ -4035,7 +4002,7 @@
           </mc:Choice>
           <mc:Fallback>
             <w:pict>
-              <v:shape w14:anchorId="51CA396E" id="_x0000_s1055" type="#_x0000_t202" style="position:absolute;left:0;text-align:left;margin-left:-61.05pt;margin-top:489pt;width:185.9pt;height:61.5pt;z-index:251680768;visibility:visible;mso-wrap-style:square;mso-width-percent:400;mso-height-percent:0;mso-wrap-distance-left:9pt;mso-wrap-distance-top:3.6pt;mso-wrap-distance-right:9pt;mso-wrap-distance-bottom:3.6pt;mso-position-horizontal:absolute;mso-position-horizontal-relative:text;mso-position-vertical:absolute;mso-position-vertical-relative:text;mso-width-percent:400;mso-height-percent:0;mso-width-relative:margin;mso-height-relative:page;v-text-anchor:top" o:gfxdata="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" filled="f" stroked="f">
+              <v:shape w14:anchorId="51CA396E" id="_x0000_s1056" type="#_x0000_t202" style="position:absolute;left:0;text-align:left;margin-left:-61.05pt;margin-top:489pt;width:185.9pt;height:61.5pt;z-index:251680768;visibility:visible;mso-wrap-style:square;mso-width-percent:400;mso-height-percent:0;mso-wrap-distance-left:9pt;mso-wrap-distance-top:3.6pt;mso-wrap-distance-right:9pt;mso-wrap-distance-bottom:3.6pt;mso-position-horizontal:absolute;mso-position-horizontal-relative:text;mso-position-vertical:absolute;mso-position-vertical-relative:text;mso-width-percent:400;mso-height-percent:0;mso-width-relative:margin;mso-height-relative:page;v-text-anchor:top" o:gfxdata="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" filled="f" stroked="f">
                 <v:textbox>
                   <w:txbxContent>
                     <w:p>
@@ -4293,7 +4260,7 @@
           </mc:Choice>
           <mc:Fallback>
             <w:pict>
-              <v:shape w14:anchorId="5D32CAC7" id="_x0000_s1056" type="#_x0000_t202" style="position:absolute;left:0;text-align:left;margin-left:-59.85pt;margin-top:430pt;width:175.5pt;height:60.75pt;z-index:251679744;visibility:visible;mso-wrap-style:square;mso-wrap-distance-left:9pt;mso-wrap-distance-top:3.6pt;mso-wrap-distance-right:9pt;mso-wrap-distance-bottom:3.6pt;mso-position-horizontal:absolute;mso-position-horizontal-relative:text;mso-position-vertical:absolute;mso-position-vertical-relative:text;v-text-anchor:top" o:gfxdata="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" filled="f" stroked="f">
+              <v:shape w14:anchorId="5D32CAC7" id="_x0000_s1057" type="#_x0000_t202" style="position:absolute;left:0;text-align:left;margin-left:-59.85pt;margin-top:430pt;width:175.5pt;height:60.75pt;z-index:251679744;visibility:visible;mso-wrap-style:square;mso-wrap-distance-left:9pt;mso-wrap-distance-top:3.6pt;mso-wrap-distance-right:9pt;mso-wrap-distance-bottom:3.6pt;mso-position-horizontal:absolute;mso-position-horizontal-relative:text;mso-position-vertical:absolute;mso-position-vertical-relative:text;v-text-anchor:top" o:gfxdata="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" filled="f" stroked="f">
                 <v:textbox>
                   <w:txbxContent>
                     <w:p>
@@ -4517,7 +4484,7 @@
           </mc:Choice>
           <mc:Fallback>
             <w:pict>
-              <v:shape w14:anchorId="32AF6DEB" id="Text Box 13" o:spid="_x0000_s1057" type="#_x0000_t202" style="position:absolute;left:0;text-align:left;margin-left:-60.85pt;margin-top:380.25pt;width:177.6pt;height:50.25pt;z-index:251678720;visibility:visible;mso-wrap-style:square;mso-wrap-distance-left:9pt;mso-wrap-distance-top:0;mso-wrap-distance-right:9pt;mso-wrap-distance-bottom:0;mso-position-horizontal:absolute;mso-position-horizontal-relative:text;mso-position-vertical:absolute;mso-position-vertical-relative:text;v-text-anchor:top" o:gfxdata="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" filled="f" stroked="f" strokeweight=".5pt">
+              <v:shape w14:anchorId="32AF6DEB" id="Text Box 13" o:spid="_x0000_s1058" type="#_x0000_t202" style="position:absolute;left:0;text-align:left;margin-left:-60.85pt;margin-top:380.25pt;width:177.6pt;height:50.25pt;z-index:251678720;visibility:visible;mso-wrap-style:square;mso-wrap-distance-left:9pt;mso-wrap-distance-top:0;mso-wrap-distance-right:9pt;mso-wrap-distance-bottom:0;mso-position-horizontal:absolute;mso-position-horizontal-relative:text;mso-position-vertical:absolute;mso-position-vertical-relative:text;v-text-anchor:top" o:gfxdata="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" filled="f" stroked="f" strokeweight=".5pt">
                 <v:textbox>
                   <w:txbxContent>
                     <w:p>
@@ -4695,7 +4662,7 @@
           </mc:Choice>
           <mc:Fallback>
             <w:pict>
-              <v:shape w14:anchorId="3FFBFA27" id="_x0000_s1058" type="#_x0000_t202" style="position:absolute;left:0;text-align:left;margin-left:-55.35pt;margin-top:185pt;width:169.5pt;height:52.5pt;z-index:251676672;visibility:visible;mso-wrap-style:square;mso-wrap-distance-left:9pt;mso-wrap-distance-top:0;mso-wrap-distance-right:9pt;mso-wrap-distance-bottom:0;mso-position-horizontal:absolute;mso-position-horizontal-relative:text;mso-position-vertical:absolute;mso-position-vertical-relative:text;v-text-anchor:top" o:gfxdata="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" filled="f" stroked="f" strokeweight=".5pt">
+              <v:shape w14:anchorId="3FFBFA27" id="_x0000_s1059" type="#_x0000_t202" style="position:absolute;left:0;text-align:left;margin-left:-55.35pt;margin-top:185pt;width:169.5pt;height:52.5pt;z-index:251676672;visibility:visible;mso-wrap-style:square;mso-wrap-distance-left:9pt;mso-wrap-distance-top:0;mso-wrap-distance-right:9pt;mso-wrap-distance-bottom:0;mso-position-horizontal:absolute;mso-position-horizontal-relative:text;mso-position-vertical:absolute;mso-position-vertical-relative:text;v-text-anchor:top" o:gfxdata="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" filled="f" stroked="f" strokeweight=".5pt">
                 <v:textbox>
                   <w:txbxContent>
                     <w:p>
@@ -5196,7 +5163,7 @@
           </mc:Choice>
           <mc:Fallback>
             <w:pict>
-              <v:shape w14:anchorId="472FDA86" id="_x0000_s1060" type="#_x0000_t202" style="position:absolute;left:0;text-align:left;margin-left:127.5pt;margin-top:309.75pt;width:378.75pt;height:43.5pt;z-index:-251656192;visibility:visible;mso-wrap-style:square;mso-wrap-distance-left:9pt;mso-wrap-distance-top:3.6pt;mso-wrap-distance-right:9pt;mso-wrap-distance-bottom:3.6pt;mso-position-horizontal:absolute;mso-position-horizontal-relative:text;mso-position-vertical:absolute;mso-position-vertical-relative:text;v-text-anchor:top" o:gfxdata="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" filled="f" stroked="f">
+              <v:shape w14:anchorId="472FDA86" id="_x0000_s1061" type="#_x0000_t202" style="position:absolute;left:0;text-align:left;margin-left:127.5pt;margin-top:309.75pt;width:378.75pt;height:43.5pt;z-index:-251656192;visibility:visible;mso-wrap-style:square;mso-wrap-distance-left:9pt;mso-wrap-distance-top:3.6pt;mso-wrap-distance-right:9pt;mso-wrap-distance-bottom:3.6pt;mso-position-horizontal:absolute;mso-position-horizontal-relative:text;mso-position-vertical:absolute;mso-position-vertical-relative:text;v-text-anchor:top" o:gfxdata="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" filled="f" stroked="f">
                 <v:textbox>
                   <w:txbxContent>
                     <w:p/>

</xml_diff>